<commit_message>
Fire Ecology submission package (built from 9bae6c7)
</commit_message>
<xml_diff>
--- a/paper/submission_fire_ecology/manuscript.docx
+++ b/paper/submission_fire_ecology/manuscript.docx
@@ -90,7 +90,7 @@
         <w:t xml:space="preserve"> </w:t>
       </w:r>
       <w:r>
-        <w:t xml:space="preserve">7,906 words. Abstract: 292 words.</w:t>
+        <w:t xml:space="preserve">7,862 words. Abstract: 342 words.</w:t>
       </w:r>
     </w:p>
     <w:p>
@@ -120,55 +120,7 @@
         <w:t xml:space="preserve"> </w:t>
       </w:r>
       <w:r>
-        <w:t xml:space="preserve">Wildfire susceptibility maps are usually scored in the region where they were trained,</w:t>
-      </w:r>
-      <w:r>
-        <w:t xml:space="preserve"> </w:t>
-      </w:r>
-      <w:r>
-        <w:t xml:space="preserve">yet agencies without a long fire record may borrow a map from elsewhere. We tested whether pre-fire</w:t>
-      </w:r>
-      <w:r>
-        <w:t xml:space="preserve"> </w:t>
-      </w:r>
-      <w:r>
-        <w:t xml:space="preserve">satellite thermal predictors, expected to track fuel dryness, transfer between Mediterranean regions.</w:t>
-      </w:r>
-      <w:r>
-        <w:t xml:space="preserve"> </w:t>
-      </w:r>
-      <w:r>
-        <w:t xml:space="preserve">Six land surface temperature (LST) and dryness predictors extended a terrain, land-cover and greenness</w:t>
-      </w:r>
-      <w:r>
-        <w:t xml:space="preserve"> </w:t>
-      </w:r>
-      <w:r>
-        <w:t xml:space="preserve">baseline. We fitted random forests in five regions, each with one large fire season (2021 or 2022):</w:t>
-      </w:r>
-      <w:r>
-        <w:t xml:space="preserve"> </w:t>
-      </w:r>
-      <w:r>
-        <w:t xml:space="preserve">Manavgat and Muğla (Türkiye), Bejís (Spain), North Evia (Greece) and Montiferru (Italy). Skill was the</w:t>
-      </w:r>
-      <w:r>
-        <w:t xml:space="preserve"> </w:t>
-      </w:r>
-      <w:r>
-        <w:t xml:space="preserve">spatially blocked area under the receiver operating characteristic curve (ROC-AUC) against Moderate</w:t>
-      </w:r>
-      <w:r>
-        <w:t xml:space="preserve"> </w:t>
-      </w:r>
-      <w:r>
-        <w:t xml:space="preserve">Resolution Imaging Spectroradiometer (MODIS) burned areas, within each region and across all twenty</w:t>
-      </w:r>
-      <w:r>
-        <w:t xml:space="preserve"> </w:t>
-      </w:r>
-      <w:r>
-        <w:t xml:space="preserve">ordered pairs of regions without target labels.</w:t>
+        <w:t xml:space="preserve">Wildfire susceptibility maps are usually evaluated in their training region, although agencies with limited fire records may need to use maps developed elsewhere. We tested whether pre-fire satellite thermal predictors, expected to track fuel dryness, improve cross-region transferability. Six land surface temperature (LST) and dryness predictors were added to a terrain, land-cover and greenness baseline. Random forests were trained separately in each of five regions, each represented by one major fire season (2021 or 2022): Manavgat and Muğla (Türkiye), Bejís (Spain), North Evia (Greece) and Montiferru (Italy). Performance was measured using spatially blocked area under the receiver operating characteristic curve (ROC-AUC) against Moderate Resolution Imaging Spectroradiometer (MODIS) burned areas, within regions and across all 20 ordered source–target pairs without target labels.</w:t>
       </w:r>
     </w:p>
     <w:p>
@@ -186,43 +138,7 @@
         <w:t xml:space="preserve"> </w:t>
       </w:r>
       <w:r>
-        <w:t xml:space="preserve">Scored on the burn scar and a 2 km collar, not region-wide, the same models lost 0.160</w:t>
-      </w:r>
-      <w:r>
-        <w:t xml:space="preserve"> </w:t>
-      </w:r>
-      <w:r>
-        <w:t xml:space="preserve">[0.090, 0.230] ROC-AUC on average. At 5 km blocking, thermal predictors added +0.045 to +0.148 within</w:t>
-      </w:r>
-      <w:r>
-        <w:t xml:space="preserve"> </w:t>
-      </w:r>
-      <w:r>
-        <w:t xml:space="preserve">regions, but only +0.007 [−0.020, +0.038] across twenty directions and +0.024 [−0.004, +0.049] on</w:t>
-      </w:r>
-      <w:r>
-        <w:t xml:space="preserve"> </w:t>
-      </w:r>
-      <w:r>
-        <w:t xml:space="preserve">comparable areas. Two label-free adaptation methods moved transfer toward chance. None of twenty</w:t>
-      </w:r>
-      <w:r>
-        <w:t xml:space="preserve"> </w:t>
-      </w:r>
-      <w:r>
-        <w:t xml:space="preserve">similarity measures was shown to predict transfer. At point estimates, the most similar pair of</w:t>
-      </w:r>
-      <w:r>
-        <w:t xml:space="preserve"> </w:t>
-      </w:r>
-      <w:r>
-        <w:t xml:space="preserve">regions failed in both directions, and hotter surfaces burned less in four of five regions (two with</w:t>
-      </w:r>
-      <w:r>
-        <w:t xml:space="preserve"> </w:t>
-      </w:r>
-      <w:r>
-        <w:t xml:space="preserve">interval support), consistent with LST describing land surface rather than dryness.</w:t>
+        <w:t xml:space="preserve">Evaluating models on the burn scar and its 2 km collar reduced ROC-AUC by 0.160 [0.090, 0.230] on average compared with region-wide evaluation. With 5 km spatial blocking, thermal predictors improved within-region ROC-AUC by 0.045–0.148, but gains were small across 20 transfer directions (+0.007 [−0.020, +0.038]) and comparable evaluation areas (+0.024 [−0.004, +0.049]). Two label-free adaptation methods moved transfer performance closer to chance, and none of the 20 similarity measures was shown to predict transfer. The most similar region pair failed to transfer in either direction at point estimates. In four of five regions, hotter surfaces were associated with less burning, with interval support in two, consistent with LST acting as a land-surface descriptor of vegetation, soil and terrain rather than a direct indicator of fuel dryness.</w:t>
       </w:r>
     </w:p>
     <w:p>
@@ -240,31 +156,7 @@
         <w:t xml:space="preserve"> </w:t>
       </w:r>
       <w:r>
-        <w:t xml:space="preserve">A score from the training region does not show how a susceptibility map will perform</w:t>
-      </w:r>
-      <w:r>
-        <w:t xml:space="preserve"> </w:t>
-      </w:r>
-      <w:r>
-        <w:t xml:space="preserve">in another region. Before a borrowed single-season model is used for prevention planning, fire</w:t>
-      </w:r>
-      <w:r>
-        <w:t xml:space="preserve"> </w:t>
-      </w:r>
-      <w:r>
-        <w:t xml:space="preserve">agencies should test it against burned areas in the target region and report on which cells its score</w:t>
-      </w:r>
-      <w:r>
-        <w:t xml:space="preserve"> </w:t>
-      </w:r>
-      <w:r>
-        <w:t xml:space="preserve">was computed. Region and event effects are confounded here, so several fire seasons per region are</w:t>
-      </w:r>
-      <w:r>
-        <w:t xml:space="preserve"> </w:t>
-      </w:r>
-      <w:r>
-        <w:t xml:space="preserve">needed to generalise.</w:t>
+        <w:t xml:space="preserve">Performance measured in one region does not demonstrate that a susceptibility map will generalise to another region. Before a model trained in one region and fire season is transferred to another region for prevention planning, its performance should be evaluated using burned areas in the target region, and the evaluation area should be clearly reported. Because region and event effects cannot be separated when each region is represented by a single fire season, multiple fire seasons within each region are needed to determine whether these findings generalise beyond individual fire events.</w:t>
       </w:r>
     </w:p>
     <w:p>
@@ -299,13 +191,7 @@
         <w:pStyle w:val="FirstParagraph"/>
       </w:pPr>
       <w:r>
-        <w:t xml:space="preserve">Wildfire is a major disturbance in Mediterranean landscapes, and climate change is changing where</w:t>
-      </w:r>
-      <w:r>
-        <w:t xml:space="preserve"> </w:t>
-      </w:r>
-      <w:r>
-        <w:t xml:space="preserve">and how it burns</w:t>
+        <w:t xml:space="preserve">Wildfire is a major disturbance in Mediterranean landscapes, and climate change is altering fire regimes</w:t>
       </w:r>
       <w:r>
         <w:t xml:space="preserve"> </w:t>
@@ -314,13 +200,7 @@
         <w:t xml:space="preserve">(Pausas and Keeley 2021)</w:t>
       </w:r>
       <w:r>
-        <w:t xml:space="preserve">. Mediterranean fire policy is urged to shift from suppression towards</w:t>
-      </w:r>
-      <w:r>
-        <w:t xml:space="preserve"> </w:t>
-      </w:r>
-      <w:r>
-        <w:t xml:space="preserve">prevention and landscape management</w:t>
+        <w:t xml:space="preserve">. Mediterranean fire policy needs to shift from suppression towards prevention and landscape management</w:t>
       </w:r>
       <w:r>
         <w:t xml:space="preserve"> </w:t>
@@ -329,13 +209,7 @@
         <w:t xml:space="preserve">(Moreira et al. 2020)</w:t>
       </w:r>
       <w:r>
-        <w:t xml:space="preserve">, and susceptibility maps support this planning.</w:t>
-      </w:r>
-      <w:r>
-        <w:t xml:space="preserve"> </w:t>
-      </w:r>
-      <w:r>
-        <w:t xml:space="preserve">Most such maps follow a common workflow</w:t>
+        <w:t xml:space="preserve">, with susceptibility maps supporting this planning. Most maps follow a common workflow</w:t>
       </w:r>
       <w:r>
         <w:t xml:space="preserve"> </w:t>
@@ -344,19 +218,7 @@
         <w:t xml:space="preserve">(Jain et al. 2020; Jodhani et al. 2026; Vibhandik et al. 2026)</w:t>
       </w:r>
       <w:r>
-        <w:t xml:space="preserve">. Predictors are</w:t>
-      </w:r>
-      <w:r>
-        <w:t xml:space="preserve"> </w:t>
-      </w:r>
-      <w:r>
-        <w:t xml:space="preserve">collected over a study region and matched with a record of burned areas, a classifier, most often a</w:t>
-      </w:r>
-      <w:r>
-        <w:t xml:space="preserve"> </w:t>
-      </w:r>
-      <w:r>
-        <w:t xml:space="preserve">random forest</w:t>
+        <w:t xml:space="preserve">, using predictors and burned-area records to train a classifier, most commonly a random forest</w:t>
       </w:r>
       <w:r>
         <w:t xml:space="preserve"> </w:t>
@@ -365,43 +227,7 @@
         <w:t xml:space="preserve">(Breiman 2001; Oliveira et al. 2012; Tonini et al. 2020)</w:t>
       </w:r>
       <w:r>
-        <w:t xml:space="preserve">, is trained, and the map is reported with a</w:t>
-      </w:r>
-      <w:r>
-        <w:t xml:space="preserve"> </w:t>
-      </w:r>
-      <w:r>
-        <w:t xml:space="preserve">cross-validated score from the same region. Agencies without a long local fire record, for example</w:t>
-      </w:r>
-      <w:r>
-        <w:t xml:space="preserve"> </w:t>
-      </w:r>
-      <w:r>
-        <w:t xml:space="preserve">after a first large fire, would instead have to use a map trained elsewhere.</w:t>
-      </w:r>
-      <w:r>
-        <w:t xml:space="preserve"> </w:t>
-      </w:r>
-      <w:r>
-        <w:rPr>
-          <w:b/>
-          <w:bCs/>
-        </w:rPr>
-        <w:t xml:space="preserve">How well the model</w:t>
-      </w:r>
-      <w:r>
-        <w:rPr>
-          <w:b/>
-          <w:bCs/>
-        </w:rPr>
-        <w:t xml:space="preserve"> </w:t>
-      </w:r>
-      <w:r>
-        <w:rPr>
-          <w:b/>
-          <w:bCs/>
-        </w:rPr>
-        <w:t xml:space="preserve">works in another region is rarely reported.</w:t>
+        <w:t xml:space="preserve">, whose performance is evaluated within the same region. However, agencies with limited local fire records may need to use a model trained elsewhere, but how well such models perform in another region is rarely reported.</w:t>
       </w:r>
     </w:p>
     <w:bookmarkStart w:id="18" w:name="transfer-is-rarely-measured"/>
@@ -418,35 +244,7 @@
         <w:pStyle w:val="FirstParagraph"/>
       </w:pPr>
       <w:r>
-        <w:t xml:space="preserve">The skill of a susceptibility model is almost always a</w:t>
-      </w:r>
-      <w:r>
-        <w:t xml:space="preserve"> </w:t>
-      </w:r>
-      <w:r>
-        <w:rPr>
-          <w:i/>
-          <w:iCs/>
-        </w:rPr>
-        <w:t xml:space="preserve">within-region</w:t>
-      </w:r>
-      <w:r>
-        <w:t xml:space="preserve"> </w:t>
-      </w:r>
-      <w:r>
-        <w:t xml:space="preserve">estimate. The test folds come</w:t>
-      </w:r>
-      <w:r>
-        <w:t xml:space="preserve"> </w:t>
-      </w:r>
-      <w:r>
-        <w:t xml:space="preserve">from the same area and season, and often from the same fire, and random folds let spatial</w:t>
-      </w:r>
-      <w:r>
-        <w:t xml:space="preserve"> </w:t>
-      </w:r>
-      <w:r>
-        <w:t xml:space="preserve">autocorrelation raise the score</w:t>
+        <w:t xml:space="preserve">Susceptibility models are usually evaluated within the regions where they are trained, often using test folds from the same area, season or fire. Random folds can inflate performance through spatial autocorrelation</w:t>
       </w:r>
       <w:r>
         <w:t xml:space="preserve"> </w:t>
@@ -455,13 +253,7 @@
         <w:t xml:space="preserve">(Roberts et al. 2017; Ploton et al. 2020)</w:t>
       </w:r>
       <w:r>
-        <w:t xml:space="preserve">. Spatially blocked cross-validation</w:t>
-      </w:r>
-      <w:r>
-        <w:t xml:space="preserve"> </w:t>
-      </w:r>
-      <w:r>
-        <w:t xml:space="preserve">reduces this optimism</w:t>
+        <w:t xml:space="preserve">, while spatial blocking reduces this optimism</w:t>
       </w:r>
       <w:r>
         <w:t xml:space="preserve"> </w:t>
@@ -470,7 +262,7 @@
         <w:t xml:space="preserve">(Meyer et al. 2018; Valavi et al. 2019)</w:t>
       </w:r>
       <w:r>
-        <w:t xml:space="preserve">, although its use for map accuracy is debated</w:t>
+        <w:t xml:space="preserve">, although its suitability for map accuracy assessment remains debated</w:t>
       </w:r>
       <w:r>
         <w:t xml:space="preserve"> </w:t>
@@ -479,13 +271,7 @@
         <w:t xml:space="preserve">(Wadoux et al. 2021; Bruin et al. 2022; Milà et al. 2022)</w:t>
       </w:r>
       <w:r>
-        <w:t xml:space="preserve">, and the area of applicability shows where predictor values</w:t>
-      </w:r>
-      <w:r>
-        <w:t xml:space="preserve"> </w:t>
-      </w:r>
-      <w:r>
-        <w:t xml:space="preserve">are too far from the training data</w:t>
+        <w:t xml:space="preserve">. The area of applicability identifies locations where predictor values are sufficiently dissimilar from the training data, based on their distance in predictor space</w:t>
       </w:r>
       <w:r>
         <w:t xml:space="preserve"> </w:t>
@@ -494,19 +280,7 @@
         <w:t xml:space="preserve">(Meyer and Pebesma 2021, 2022; Ludwig et al. 2023)</w:t>
       </w:r>
       <w:r>
-        <w:t xml:space="preserve">. Neither shows how a model</w:t>
-      </w:r>
-      <w:r>
-        <w:t xml:space="preserve"> </w:t>
-      </w:r>
-      <w:r>
-        <w:t xml:space="preserve">works on a fire it has not seen. Transferability must be tested on spatially or temporally separate</w:t>
-      </w:r>
-      <w:r>
-        <w:t xml:space="preserve"> </w:t>
-      </w:r>
-      <w:r>
-        <w:t xml:space="preserve">data</w:t>
+        <w:t xml:space="preserve">. However, neither approach establishes performance on an unseen fire. Transferability requires testing on spatially or temporally independent data</w:t>
       </w:r>
       <w:r>
         <w:t xml:space="preserve"> </w:t>
@@ -515,7 +289,10 @@
         <w:t xml:space="preserve">(Wenger and Olden 2012)</w:t>
       </w:r>
       <w:r>
-        <w:t xml:space="preserve">, and it remains an open problem in ecological modelling</w:t>
+        <w:t xml:space="preserve"> </w:t>
+      </w:r>
+      <w:r>
+        <w:t xml:space="preserve">and remains an open challenge in ecological modelling</w:t>
       </w:r>
       <w:r>
         <w:t xml:space="preserve"> </w:t>
@@ -532,13 +309,7 @@
         <w:pStyle w:val="BodyText"/>
       </w:pPr>
       <w:r>
-        <w:t xml:space="preserve">Few studies test the transfer of fire models directly. Fire-danger indices, which are driven by</w:t>
-      </w:r>
-      <w:r>
-        <w:t xml:space="preserve"> </w:t>
-      </w:r>
-      <w:r>
-        <w:t xml:space="preserve">weather, did not transfer well between fire environments in Peru</w:t>
+        <w:t xml:space="preserve">Few studies directly assess the transferability of fire models. Weather-driven fire-danger indices transferred poorly between fire environments in Peru</w:t>
       </w:r>
       <w:r>
         <w:t xml:space="preserve"> </w:t>
@@ -547,19 +318,7 @@
         <w:t xml:space="preserve">(Podschwit et al. 2022)</w:t>
       </w:r>
       <w:r>
-        <w:t xml:space="preserve">. Operational</w:t>
-      </w:r>
-      <w:r>
-        <w:t xml:space="preserve"> </w:t>
-      </w:r>
-      <w:r>
-        <w:t xml:space="preserve">fire-danger rating in Europe, as in the European Forest Fire Information System, also rests on</w:t>
-      </w:r>
-      <w:r>
-        <w:t xml:space="preserve"> </w:t>
-      </w:r>
-      <w:r>
-        <w:t xml:space="preserve">weather-driven indices such as the Canadian Fire Weather Index</w:t>
+        <w:t xml:space="preserve">. European operational fire-danger systems, including the European Forest Fire Information System, also rely on weather-based indices such as the Canadian Fire Weather Index</w:t>
       </w:r>
       <w:r>
         <w:t xml:space="preserve"> </w:t>
@@ -568,13 +327,7 @@
         <w:t xml:space="preserve">(Vitolo et al. 2020)</w:t>
       </w:r>
       <w:r>
-        <w:t xml:space="preserve">, and large</w:t>
-      </w:r>
-      <w:r>
-        <w:t xml:space="preserve"> </w:t>
-      </w:r>
-      <w:r>
-        <w:t xml:space="preserve">Mediterranean fires grow under heat, wind and drought</w:t>
+        <w:t xml:space="preserve">, while major Mediterranean fires are driven by heat, wind and drought</w:t>
       </w:r>
       <w:r>
         <w:t xml:space="preserve"> </w:t>
@@ -583,19 +336,7 @@
         <w:t xml:space="preserve">(Ruffault et al. 2020; Ghasemiazma et al. 2026)</w:t>
       </w:r>
       <w:r>
-        <w:t xml:space="preserve">. Regional</w:t>
-      </w:r>
-      <w:r>
-        <w:t xml:space="preserve"> </w:t>
-      </w:r>
-      <w:r>
-        <w:t xml:space="preserve">fire-occurrence models in the Alps and the Mediterranean Basin transferred well only under similar</w:t>
-      </w:r>
-      <w:r>
-        <w:t xml:space="preserve"> </w:t>
-      </w:r>
-      <w:r>
-        <w:t xml:space="preserve">conditions, and a pooled model was more robust</w:t>
+        <w:t xml:space="preserve">. Regional fire-occurrence models transferred well across the Alps and Mediterranean Basin only under similar conditions, with a pooled model proving more robust</w:t>
       </w:r>
       <w:r>
         <w:t xml:space="preserve"> </w:t>
@@ -616,19 +357,7 @@
         <w:t xml:space="preserve"> </w:t>
       </w:r>
       <w:r>
-        <w:t xml:space="preserve">found good</w:t>
-      </w:r>
-      <w:r>
-        <w:t xml:space="preserve"> </w:t>
-      </w:r>
-      <w:r>
-        <w:t xml:space="preserve">transfer between similar US counties and poor transfer between dissimilar ones, with a composite of</w:t>
-      </w:r>
-      <w:r>
-        <w:t xml:space="preserve"> </w:t>
-      </w:r>
-      <w:r>
-        <w:t xml:space="preserve">hazard indicators as the label rather than observed burned area. The closest Mediterranean study</w:t>
+        <w:t xml:space="preserve">likewise found better transfer between similar US counties than dissimilar ones, but used composite hazard indicators rather than observed burned areas as the response. The closest Mediterranean study</w:t>
       </w:r>
       <w:r>
         <w:t xml:space="preserve"> </w:t>
@@ -640,31 +369,7 @@
         <w:t xml:space="preserve"> </w:t>
       </w:r>
       <w:r>
-        <w:t xml:space="preserve">used 500 m predictors in four countries and a full transfer matrix. No transfer fell</w:t>
-      </w:r>
-      <w:r>
-        <w:t xml:space="preserve"> </w:t>
-      </w:r>
-      <w:r>
-        <w:t xml:space="preserve">below an AUC of 0.80, and similar countries scored higher, but the predictors were static attributes</w:t>
-      </w:r>
-      <w:r>
-        <w:t xml:space="preserve"> </w:t>
-      </w:r>
-      <w:r>
-        <w:t xml:space="preserve">of a place and the response was human-caused ignition. Susceptibility has also been mapped with one</w:t>
-      </w:r>
-      <w:r>
-        <w:t xml:space="preserve"> </w:t>
-      </w:r>
-      <w:r>
-        <w:t xml:space="preserve">random forest for thirteen countries of the eastern Mediterranean and southern Black Sea from a decade</w:t>
-      </w:r>
-      <w:r>
-        <w:t xml:space="preserve"> </w:t>
-      </w:r>
-      <w:r>
-        <w:t xml:space="preserve">of fires</w:t>
+        <w:t xml:space="preserve">evaluated a full transfer matrix across four countries using 500 m predictors; all transfers achieved an AUC of at least 0.80, with higher scores between similar countries. However, its predictors described static place characteristics, and its response was human-caused ignition. A random forest susceptibility model covering thirteen eastern Mediterranean and southern Black Sea countries was trained on a decade of fire records</w:t>
       </w:r>
       <w:r>
         <w:t xml:space="preserve"> </w:t>
@@ -673,19 +378,7 @@
         <w:t xml:space="preserve">(Trucchia et al. 2023)</w:t>
       </w:r>
       <w:r>
-        <w:t xml:space="preserve">, but such a model is fitted on all regions at once, so it does not measure</w:t>
-      </w:r>
-      <w:r>
-        <w:t xml:space="preserve"> </w:t>
-      </w:r>
-      <w:r>
-        <w:t xml:space="preserve">transfer to a region without a fire record.</w:t>
-      </w:r>
-      <w:r>
-        <w:t xml:space="preserve"> </w:t>
-      </w:r>
-      <w:r>
-        <w:t xml:space="preserve">Conclusions about wildfire models also depend on how they are evaluated</w:t>
+        <w:t xml:space="preserve">, but fitting all regions jointly does not test transfer to a region without a fire record. More broadly, conclusions about wildfire models depend on how performance is evaluated</w:t>
       </w:r>
       <w:r>
         <w:t xml:space="preserve"> </w:t>
@@ -702,13 +395,7 @@
         <w:pStyle w:val="BodyText"/>
       </w:pPr>
       <w:r>
-        <w:t xml:space="preserve">When a model is moved, the predictor distribution may change (covariate shift), which can in</w:t>
-      </w:r>
-      <w:r>
-        <w:t xml:space="preserve"> </w:t>
-      </w:r>
-      <w:r>
-        <w:t xml:space="preserve">principle be corrected without target labels, for example by covariance alignment (CORAL)</w:t>
+        <w:t xml:space="preserve">When a model is transferred to a new region, its predictor distribution may change (covariate shift). This can potentially be addressed without target labels using methods such as covariance alignment (CORAL)</w:t>
       </w:r>
       <w:r>
         <w:t xml:space="preserve"> </w:t>
@@ -717,7 +404,7 @@
         <w:t xml:space="preserve">(Sun et al. 2016)</w:t>
       </w:r>
       <w:r>
-        <w:t xml:space="preserve">, as is common in remote sensing</w:t>
+        <w:t xml:space="preserve">. Domain adaptation more broadly is well established in remote sensing</w:t>
       </w:r>
       <w:r>
         <w:t xml:space="preserve"> </w:t>
@@ -726,13 +413,7 @@
         <w:t xml:space="preserve">(Persello and Bruzzone 2012; Tuia et al. 2016)</w:t>
       </w:r>
       <w:r>
-        <w:t xml:space="preserve">, where shift decomposition</w:t>
-      </w:r>
-      <w:r>
-        <w:t xml:space="preserve"> </w:t>
-      </w:r>
-      <w:r>
-        <w:t xml:space="preserve">has also been used</w:t>
+        <w:t xml:space="preserve">, including approaches that decompose different sources of shift</w:t>
       </w:r>
       <w:r>
         <w:t xml:space="preserve"> </w:t>
@@ -741,13 +422,7 @@
         <w:t xml:space="preserve">(Huang et al. 2026)</w:t>
       </w:r>
       <w:r>
-        <w:t xml:space="preserve">. The predictor-response relationship itself may also change (concept</w:t>
-      </w:r>
-      <w:r>
-        <w:t xml:space="preserve"> </w:t>
-      </w:r>
-      <w:r>
-        <w:t xml:space="preserve">shift)</w:t>
+        <w:t xml:space="preserve">. However, the predictor-response relationship may also change (concept shift)</w:t>
       </w:r>
       <w:r>
         <w:t xml:space="preserve"> </w:t>
@@ -756,13 +431,7 @@
         <w:t xml:space="preserve">(Moreno-Torres et al. 2012)</w:t>
       </w:r>
       <w:r>
-        <w:t xml:space="preserve">, and a reversed association can only be seen with target labels. We found</w:t>
-      </w:r>
-      <w:r>
-        <w:t xml:space="preserve"> </w:t>
-      </w:r>
-      <w:r>
-        <w:t xml:space="preserve">no use of covariance alignment for fire susceptibility or burned-area prediction.</w:t>
+        <w:t xml:space="preserve">, and detecting a reversal in association requires target labels. We found no previous application of covariance alignment to fire susceptibility or burned-area prediction.</w:t>
       </w:r>
     </w:p>
     <w:bookmarkEnd w:id="18"/>
@@ -1573,7 +1242,7 @@
               <a:graphicData uri="http://schemas.openxmlformats.org/drawingml/2006/picture">
                 <pic:pic>
                   <pic:nvPicPr>
-                    <pic:cNvPr descr="C:/Users/CORSAIR/projects/thermal-twin-main/paper/submission_fire_ecology/_embed/Fig1.png" id="25" name="Picture"/>
+                    <pic:cNvPr descr="C:/Users/CORSAIR/projects/ThermalTwin/thermal-twin-main/paper/submission_fire_ecology/_embed/Fig1.png" id="25" name="Picture"/>
                     <pic:cNvPicPr>
                       <a:picLocks noChangeArrowheads="1" noChangeAspect="1"/>
                     </pic:cNvPicPr>
@@ -1728,7 +1397,7 @@
               <a:graphicData uri="http://schemas.openxmlformats.org/drawingml/2006/picture">
                 <pic:pic>
                   <pic:nvPicPr>
-                    <pic:cNvPr descr="C:/Users/CORSAIR/projects/thermal-twin-main/paper/submission_fire_ecology/_embed/Fig2.png" id="28" name="Picture"/>
+                    <pic:cNvPr descr="C:/Users/CORSAIR/projects/ThermalTwin/thermal-twin-main/paper/submission_fire_ecology/_embed/Fig2.png" id="28" name="Picture"/>
                     <pic:cNvPicPr>
                       <a:picLocks noChangeArrowheads="1" noChangeAspect="1"/>
                     </pic:cNvPicPr>
@@ -5641,7 +5310,7 @@
               <a:graphicData uri="http://schemas.openxmlformats.org/drawingml/2006/picture">
                 <pic:pic>
                   <pic:nvPicPr>
-                    <pic:cNvPr descr="C:/Users/CORSAIR/projects/thermal-twin-main/paper/submission_fire_ecology/_embed/Fig3.png" id="46" name="Picture"/>
+                    <pic:cNvPr descr="C:/Users/CORSAIR/projects/ThermalTwin/thermal-twin-main/paper/submission_fire_ecology/_embed/Fig3.png" id="46" name="Picture"/>
                     <pic:cNvPicPr>
                       <a:picLocks noChangeArrowheads="1" noChangeAspect="1"/>
                     </pic:cNvPicPr>
@@ -9519,7 +9188,7 @@
               <a:graphicData uri="http://schemas.openxmlformats.org/drawingml/2006/picture">
                 <pic:pic>
                   <pic:nvPicPr>
-                    <pic:cNvPr descr="C:/Users/CORSAIR/projects/thermal-twin-main/paper/submission_fire_ecology/_embed/Fig4.png" id="52" name="Picture"/>
+                    <pic:cNvPr descr="C:/Users/CORSAIR/projects/ThermalTwin/thermal-twin-main/paper/submission_fire_ecology/_embed/Fig4.png" id="52" name="Picture"/>
                     <pic:cNvPicPr>
                       <a:picLocks noChangeArrowheads="1" noChangeAspect="1"/>
                     </pic:cNvPicPr>
@@ -9951,7 +9620,7 @@
               <a:graphicData uri="http://schemas.openxmlformats.org/drawingml/2006/picture">
                 <pic:pic>
                   <pic:nvPicPr>
-                    <pic:cNvPr descr="C:/Users/CORSAIR/projects/thermal-twin-main/paper/submission_fire_ecology/_embed/Fig5.png" id="55" name="Picture"/>
+                    <pic:cNvPr descr="C:/Users/CORSAIR/projects/ThermalTwin/thermal-twin-main/paper/submission_fire_ecology/_embed/Fig5.png" id="55" name="Picture"/>
                     <pic:cNvPicPr>
                       <a:picLocks noChangeArrowheads="1" noChangeAspect="1"/>
                     </pic:cNvPicPr>
@@ -10122,7 +9791,7 @@
               <a:graphicData uri="http://schemas.openxmlformats.org/drawingml/2006/picture">
                 <pic:pic>
                   <pic:nvPicPr>
-                    <pic:cNvPr descr="C:/Users/CORSAIR/projects/thermal-twin-main/paper/submission_fire_ecology/_embed/Fig6.png" id="59" name="Picture"/>
+                    <pic:cNvPr descr="C:/Users/CORSAIR/projects/ThermalTwin/thermal-twin-main/paper/submission_fire_ecology/_embed/Fig6.png" id="59" name="Picture"/>
                     <pic:cNvPicPr>
                       <a:picLocks noChangeArrowheads="1" noChangeAspect="1"/>
                     </pic:cNvPicPr>
@@ -10231,7 +9900,7 @@
               <a:graphicData uri="http://schemas.openxmlformats.org/drawingml/2006/picture">
                 <pic:pic>
                   <pic:nvPicPr>
-                    <pic:cNvPr descr="C:/Users/CORSAIR/projects/thermal-twin-main/paper/submission_fire_ecology/_embed/Fig7.png" id="62" name="Picture"/>
+                    <pic:cNvPr descr="C:/Users/CORSAIR/projects/ThermalTwin/thermal-twin-main/paper/submission_fire_ecology/_embed/Fig7.png" id="62" name="Picture"/>
                     <pic:cNvPicPr>
                       <a:picLocks noChangeArrowheads="1" noChangeAspect="1"/>
                     </pic:cNvPicPr>
@@ -10524,7 +10193,7 @@
               <a:graphicData uri="http://schemas.openxmlformats.org/drawingml/2006/picture">
                 <pic:pic>
                   <pic:nvPicPr>
-                    <pic:cNvPr descr="C:/Users/CORSAIR/projects/thermal-twin-main/paper/submission_fire_ecology/_embed/Fig8.png" id="65" name="Picture"/>
+                    <pic:cNvPr descr="C:/Users/CORSAIR/projects/ThermalTwin/thermal-twin-main/paper/submission_fire_ecology/_embed/Fig8.png" id="65" name="Picture"/>
                     <pic:cNvPicPr>
                       <a:picLocks noChangeArrowheads="1" noChangeAspect="1"/>
                     </pic:cNvPicPr>

</xml_diff>

<commit_message>
Fire Ecology submission package (built from 5f97fec)
</commit_message>
<xml_diff>
--- a/paper/submission_fire_ecology/manuscript.docx
+++ b/paper/submission_fire_ecology/manuscript.docx
@@ -90,7 +90,7 @@
         <w:t xml:space="preserve"> </w:t>
       </w:r>
       <w:r>
-        <w:t xml:space="preserve">8,549 words. Abstract: 332 words.</w:t>
+        <w:t xml:space="preserve">8,536 words. Abstract: 332 words.</w:t>
       </w:r>
     </w:p>
     <w:p>
@@ -1161,13 +1161,13 @@
         <w:t xml:space="preserve"> </w:t>
       </w:r>
       <w:r>
-        <w:t xml:space="preserve">the analyses listed in Tables S21 and S35 (Sections S1.22 and S1.23) after the first results; they</w:t>
-      </w:r>
-      <w:r>
-        <w:t xml:space="preserve"> </w:t>
-      </w:r>
-      <w:r>
-        <w:t xml:space="preserve">are exploratory, and we report them as such. Sections and tables numbered with S (for example Section S1.23 and Table S21) are in Additional file 1.</w:t>
+        <w:t xml:space="preserve">the checks of Section S1 after the first results; they</w:t>
+      </w:r>
+      <w:r>
+        <w:t xml:space="preserve"> </w:t>
+      </w:r>
+      <w:r>
+        <w:t xml:space="preserve">are exploratory, and we report them as such. Sections, figures and tables numbered with S (for example Section S1.2, Fig. S1 and Table S1) are in Additional file 1.</w:t>
       </w:r>
     </w:p>
     <w:bookmarkStart w:id="32" w:name="sec_2_1"/>
@@ -2332,7 +2332,7 @@
         </w:r>
       </w:hyperlink>
       <w:r>
-        <w:t xml:space="preserve">). Bounding boxes and baseline years are given in Table S19.</w:t>
+        <w:t xml:space="preserve">). Bounding boxes and baseline years are given in Table S13.</w:t>
       </w:r>
     </w:p>
     <w:p>
@@ -2456,13 +2456,13 @@
         <w:t xml:space="preserve"> </w:t>
       </w:r>
       <w:r>
-        <w:t xml:space="preserve">fraction (Section S3.3, Table S19). We kept the first Evia rectangle as a sensitivity analysis</w:t>
-      </w:r>
-      <w:r>
-        <w:t xml:space="preserve"> </w:t>
-      </w:r>
-      <w:r>
-        <w:t xml:space="preserve">(Section S1.1). A sixth region, Kozan 2023, was a negative control for the gate of</w:t>
+        <w:t xml:space="preserve">fraction (Section S5.2, Table S13). We kept the first Evia rectangle as a sensitivity analysis</w:t>
+      </w:r>
+      <w:r>
+        <w:t xml:space="preserve"> </w:t>
+      </w:r>
+      <w:r>
+        <w:t xml:space="preserve">(Section S1.2). A sixth region, Kozan 2023, was a negative control for the gate of</w:t>
       </w:r>
       <w:r>
         <w:t xml:space="preserve"> </w:t>
@@ -2721,7 +2721,7 @@
         <w:t xml:space="preserve"> </w:t>
       </w:r>
       <w:r>
-        <w:t xml:space="preserve">(Section S1.23). We sampled the MCD64A1 monthly burn-date layer onto the 30 m reference</w:t>
+        <w:t xml:space="preserve">(Figs. S1 and S2). We sampled the MCD64A1 monthly burn-date layer onto the 30 m reference</w:t>
       </w:r>
       <w:r>
         <w:t xml:space="preserve"> </w:t>
@@ -2846,7 +2846,7 @@
         <w:t xml:space="preserve"> </w:t>
       </w:r>
       <w:r>
-        <w:t xml:space="preserve">+0.007 to +0.003, while the within-region gain stayed positive in all regions (Section S3.1.1).</w:t>
+        <w:t xml:space="preserve">+0.007 to +0.003, while the within-region gain stayed positive in all regions (Table S12; Figs. S1 and S2).</w:t>
       </w:r>
     </w:p>
     <w:p>
@@ -2894,7 +2894,7 @@
         <w:t xml:space="preserve"> </w:t>
       </w:r>
       <w:r>
-        <w:t xml:space="preserve">before this correction; the correction and its control run are described in Section S3.1.2.</w:t>
+        <w:t xml:space="preserve">before this correction; the correction and its control run are described in Section S5.1.</w:t>
       </w:r>
     </w:p>
     <w:bookmarkEnd w:id="33"/>
@@ -2939,7 +2939,7 @@
         <w:t xml:space="preserve"> </w:t>
       </w:r>
       <w:r>
-        <w:t xml:space="preserve">cropland control if the cropland fraction was at least 0.50 (Section S3.1).</w:t>
+        <w:t xml:space="preserve">cropland control if the cropland fraction was at least 0.50 (Section S5.1).</w:t>
       </w:r>
     </w:p>
     <w:bookmarkEnd w:id="34"/>
@@ -2957,7 +2957,7 @@
         <w:pStyle w:val="FirstParagraph"/>
       </w:pPr>
       <w:r>
-        <w:t xml:space="preserve">We used ten predictors (Table S20). The</w:t>
+        <w:t xml:space="preserve">We used ten predictors (Table S14). The</w:t>
       </w:r>
       <w:r>
         <w:t xml:space="preserve"> </w:t>
@@ -3097,13 +3097,13 @@
         <w:t xml:space="preserve"> </w:t>
       </w:r>
       <w:r>
-        <w:t xml:space="preserve">the same moisture state in two regions (Section S3.4). The median pixel had three to six clear</w:t>
-      </w:r>
-      <w:r>
-        <w:t xml:space="preserve"> </w:t>
-      </w:r>
-      <w:r>
-        <w:t xml:space="preserve">Landsat observations in the predictor window, and one to seven in each baseline year (Table S36). We</w:t>
+        <w:t xml:space="preserve">the same moisture state in two regions (Section S5.3). The median pixel had three to six clear</w:t>
+      </w:r>
+      <w:r>
+        <w:t xml:space="preserve"> </w:t>
+      </w:r>
+      <w:r>
+        <w:t xml:space="preserve">Landsat observations in the predictor window, and one to seven in each baseline year (Table S15). We</w:t>
       </w:r>
       <w:r>
         <w:t xml:space="preserve"> </w:t>
@@ -3146,7 +3146,7 @@
         <w:t xml:space="preserve"> </w:t>
       </w:r>
       <w:r>
-        <w:t xml:space="preserve">LST (Section S1.6). The current TVDI is normalised within each scene but not against the baseline, so</w:t>
+        <w:t xml:space="preserve">LST (Section S1.2). The current TVDI is normalised within each scene but not against the baseline, so</w:t>
       </w:r>
       <w:r>
         <w:t xml:space="preserve"> </w:t>
@@ -3176,7 +3176,7 @@
         <w:t xml:space="preserve"> </w:t>
       </w:r>
       <w:r>
-        <w:t xml:space="preserve">relative humidity in the predictor window (Section S1.23).</w:t>
+        <w:t xml:space="preserve">relative humidity in the predictor window (Table S1).</w:t>
       </w:r>
     </w:p>
     <w:p>
@@ -3247,7 +3247,7 @@
         <w:t xml:space="preserve"> </w:t>
       </w:r>
       <w:r>
-        <w:t xml:space="preserve">no conclusion changed (Section S1.23).</w:t>
+        <w:t xml:space="preserve">no conclusion changed (Section S1.1).</w:t>
       </w:r>
     </w:p>
     <w:bookmarkEnd w:id="35"/>
@@ -3328,7 +3328,7 @@
         <w:t xml:space="preserve"> </w:t>
       </w:r>
       <w:r>
-        <w:t xml:space="preserve">related to burning (AUC 0.49 to 0.51 in every region; Table S35). We used a</w:t>
+        <w:t xml:space="preserve">related to burning (AUC 0.49 to 0.51 in every region; Table S1). We used a</w:t>
       </w:r>
       <w:r>
         <w:t xml:space="preserve"> </w:t>
@@ -3350,7 +3350,7 @@
         <w:t xml:space="preserve"> </w:t>
       </w:r>
       <w:r>
-        <w:t xml:space="preserve">of all valid cells only as a within-region sensitivity analysis in two regions (Section S1.17).</w:t>
+        <w:t xml:space="preserve">of all valid cells only as a within-region sensitivity analysis in two regions (Section S1.1).</w:t>
       </w:r>
     </w:p>
     <w:bookmarkEnd w:id="36"/>
@@ -4276,7 +4276,7 @@
         <w:t xml:space="preserve"> </w:t>
       </w:r>
       <w:r>
-        <w:t xml:space="preserve">20 to 40 km (Section S1.23), so intervals at 5 km blocking may be too narrow, and we give the 10 km</w:t>
+        <w:t xml:space="preserve">20 to 40 km (Table S1), so intervals at 5 km blocking may be too narrow, and we give the 10 km</w:t>
       </w:r>
       <w:r>
         <w:t xml:space="preserve"> </w:t>
@@ -4330,7 +4330,7 @@
         <w:t xml:space="preserve"> </w:t>
       </w:r>
       <w:r>
-        <w:t xml:space="preserve">S1.22: the naive bootstrap over directions, clustering by target region and by source region, a</w:t>
+        <w:t xml:space="preserve">S1.3: the naive bootstrap over directions, clustering by target region and by source region, a</w:t>
       </w:r>
       <w:r>
         <w:t xml:space="preserve"> </w:t>
@@ -4470,7 +4470,7 @@
         <w:t xml:space="preserve"> </w:t>
       </w:r>
       <w:r>
-        <w:t xml:space="preserve">five families (Table S17; Section S3.2). The marginal family compares the predictor distributions:</w:t>
+        <w:t xml:space="preserve">five families (Table S11; Section S4.5). The marginal family compares the predictor distributions:</w:t>
       </w:r>
       <w:r>
         <w:t xml:space="preserve"> </w:t>
@@ -4670,13 +4670,13 @@
         <w:t xml:space="preserve"> </w:t>
       </w:r>
       <w:r>
-        <w:t xml:space="preserve">labels. We did not choose λ by performance; we report its effect in Sections S1.2 and S1.23 and give</w:t>
-      </w:r>
-      <w:r>
-        <w:t xml:space="preserve"> </w:t>
-      </w:r>
-      <w:r>
-        <w:t xml:space="preserve">details in Section S3.8.</w:t>
+        <w:t xml:space="preserve">labels. We did not choose λ by performance; we report its effect in Section S1.2 and give</w:t>
+      </w:r>
+      <w:r>
+        <w:t xml:space="preserve"> </w:t>
+      </w:r>
+      <w:r>
+        <w:t xml:space="preserve">details in Section S5.6.</w:t>
       </w:r>
     </w:p>
     <w:bookmarkEnd w:id="42"/>
@@ -5207,7 +5207,7 @@
         <w:t xml:space="preserve"> </w:t>
       </w:r>
       <w:r>
-        <w:t xml:space="preserve">(Section S3.7).</w:t>
+        <w:t xml:space="preserve">(Section S5.5).</w:t>
       </w:r>
     </w:p>
     <w:p>
@@ -5276,7 +5276,7 @@
         <w:t xml:space="preserve"> </w:t>
       </w:r>
       <w:r>
-        <w:t xml:space="preserve">correction over each family of feature-by-pair comparisons (Section S1.19). A marginal reversal can</w:t>
+        <w:t xml:space="preserve">correction over each family of feature-by-pair comparisons (Section S3.2). A marginal reversal can</w:t>
       </w:r>
       <w:r>
         <w:t xml:space="preserve"> </w:t>
@@ -5385,7 +5385,7 @@
         <w:t xml:space="preserve"> </w:t>
       </w:r>
       <w:r>
-        <w:t xml:space="preserve">each predictor alone. We did not repeat the selection under the corrected label (Table S10). Because</w:t>
+        <w:t xml:space="preserve">each predictor alone. We did not repeat the selection under the corrected label (Table S3). Because</w:t>
       </w:r>
       <w:r>
         <w:t xml:space="preserve"> </w:t>
@@ -6040,7 +6040,7 @@
         <w:t xml:space="preserve"> </w:t>
       </w:r>
       <w:r>
-        <w:t xml:space="preserve">sample, a negative-pool swap and a positive-pool swap (Section S1.9.3).</w:t>
+        <w:t xml:space="preserve">sample, a negative-pool swap and a positive-pool swap (Section S2.1).</w:t>
       </w:r>
     </w:p>
     <w:p>
@@ -6078,7 +6078,7 @@
         <w:t xml:space="preserve"> </w:t>
       </w:r>
       <w:r>
-        <w:t xml:space="preserve">placed away from any burned cell (Table S21).</w:t>
+        <w:t xml:space="preserve">placed away from any burned cell (Table S1).</w:t>
       </w:r>
     </w:p>
     <w:p>
@@ -6617,7 +6617,7 @@
         <w:t xml:space="preserve"> </w:t>
       </w:r>
       <w:r>
-        <w:t xml:space="preserve">training cells (Section S1.18).</w:t>
+        <w:t xml:space="preserve">training cells (Section S2.2).</w:t>
       </w:r>
     </w:p>
     <w:p>
@@ -6679,7 +6679,7 @@
         <w:t xml:space="preserve"> </w:t>
       </w:r>
       <w:r>
-        <w:t xml:space="preserve">deviation at most 0.015; Section S1.23), and this variation is not part of the direction-level</w:t>
+        <w:t xml:space="preserve">deviation at most 0.015; Table S1), and this variation is not part of the direction-level</w:t>
       </w:r>
       <w:r>
         <w:t xml:space="preserve"> </w:t>
@@ -6691,7 +6691,7 @@
         <w:t xml:space="preserve"> </w:t>
       </w:r>
       <w:r>
-        <w:t xml:space="preserve">5 km three verdicts change (Section S1.20).</w:t>
+        <w:t xml:space="preserve">5 km three verdicts change (Section S4.1).</w:t>
       </w:r>
     </w:p>
     <w:p>
@@ -6705,13 +6705,13 @@
         <w:t xml:space="preserve"> </w:t>
       </w:r>
       <w:r>
-        <w:t xml:space="preserve">outputs exactly within regions and to within 1.3×10⁻⁸ in transfer (Section S3.6.2). Under</w:t>
-      </w:r>
-      <w:r>
-        <w:t xml:space="preserve"> </w:t>
-      </w:r>
-      <w:r>
-        <w:t xml:space="preserve">scikit-learn 1.5.2 instead of 1.9.0, single-direction AUCs moved by up to 0.047 (Section S3.5(vi)), so</w:t>
+        <w:t xml:space="preserve">outputs exactly within regions and to within 1.3×10⁻⁸ in transfer (Section S5.7). Under</w:t>
+      </w:r>
+      <w:r>
+        <w:t xml:space="preserve"> </w:t>
+      </w:r>
+      <w:r>
+        <w:t xml:space="preserve">scikit-learn 1.5.2 instead of 1.9.0, single-direction AUCs moved by up to 0.047 (Section S5.7), so</w:t>
       </w:r>
       <w:r>
         <w:t xml:space="preserve"> </w:t>
@@ -6781,7 +6781,7 @@
         <w:t xml:space="preserve"> </w:t>
       </w:r>
       <w:r>
-        <w:t xml:space="preserve">population (Section S1.1).</w:t>
+        <w:t xml:space="preserve">population (Section S1.2).</w:t>
       </w:r>
     </w:p>
     <w:bookmarkEnd w:id="51"/>
@@ -6854,13 +6854,13 @@
         <w:t xml:space="preserve"> </w:t>
       </w:r>
       <w:r>
-        <w:t xml:space="preserve">up to two weeks earlier (Section S1.4), and at the point estimates in all five regions with labels</w:t>
-      </w:r>
-      <w:r>
-        <w:t xml:space="preserve"> </w:t>
-      </w:r>
-      <w:r>
-        <w:t xml:space="preserve">from VIIRS VNP64A1 instead of MCD64A1 (Section S1.23). When terrain aspect was added to both feature</w:t>
+        <w:t xml:space="preserve">up to two weeks earlier (Fig. S1), and at the point estimates in all five regions with labels</w:t>
+      </w:r>
+      <w:r>
+        <w:t xml:space="preserve"> </w:t>
+      </w:r>
+      <w:r>
+        <w:t xml:space="preserve">from VIIRS VNP64A1 instead of MCD64A1. When terrain aspect was added to both feature</w:t>
       </w:r>
       <w:r>
         <w:t xml:space="preserve"> </w:t>
@@ -6872,7 +6872,7 @@
         <w:t xml:space="preserve"> </w:t>
       </w:r>
       <w:r>
-        <w:t xml:space="preserve">in Montiferru (Section S1.23).</w:t>
+        <w:t xml:space="preserve">in Montiferru (Fig. S1).</w:t>
       </w:r>
     </w:p>
     <w:bookmarkStart w:id="55" w:name="fig_3"/>
@@ -8669,7 +8669,7 @@
         </w:r>
       </w:hyperlink>
       <w:r>
-        <w:t xml:space="preserve">); paired spatial-block bootstrap, 1000 replicates. Block sizes of 2, 10 and 20 cells correspond to about 1, 5 and 10 km. The Baseline and Thermal columns are ROC-AUC, and the 95 % confidence interval (CI) belongs to ΔAUC. Source files are listed in the Supplementary Material. At 10 cells (about 5 km), every region has 16 to 70 blocks with burned cells, so this is the coarsest blocking that the design supports. The 20-cell rows are indicative. Block counts are given in Section S1.3.</w:t>
+        <w:t xml:space="preserve">); paired spatial-block bootstrap, 1000 replicates. Block sizes of 2, 10 and 20 cells correspond to about 1, 5 and 10 km. The Baseline and Thermal columns are ROC-AUC, and the 95 % confidence interval (CI) belongs to ΔAUC. Source files are listed in the Supplementary Material. At 10 cells (about 5 km), every region has 16 to 70 blocks with burned cells, so this is the coarsest blocking that the design supports. The 20-cell rows are indicative. Block counts are given in Section S5.4.</w:t>
       </w:r>
     </w:p>
     <w:bookmarkEnd w:id="57"/>
@@ -9235,7 +9235,7 @@
         <w:t xml:space="preserve"> </w:t>
       </w:r>
       <w:r>
-        <w:t xml:space="preserve">intervals treat scars as independent; region-level estimates are given in the text. Cell counts per scar are in Table S1.</w:t>
+        <w:t xml:space="preserve">intervals treat scars as independent; region-level estimates are given in the text. Cell counts per scar are in Fig. S4.</w:t>
       </w:r>
     </w:p>
     <w:p>
@@ -9275,7 +9275,7 @@
         <w:t xml:space="preserve"> </w:t>
       </w:r>
       <w:r>
-        <w:t xml:space="preserve">and Bejís, which have no row C (Tables S1 and S5). With the region as the unit, the change then cost</w:t>
+        <w:t xml:space="preserve">and Bejís, which have no row C (Fig. S4). With the region as the unit, the change then cost</w:t>
       </w:r>
       <w:r>
         <w:t xml:space="preserve"> </w:t>
@@ -9351,7 +9351,7 @@
         <w:t xml:space="preserve"> </w:t>
       </w:r>
       <w:r>
-        <w:t xml:space="preserve">of this, and replacing only the burned cells −0.002 [−0.055, +0.051] (Section S1.9.1). A placebo</w:t>
+        <w:t xml:space="preserve">of this, and replacing only the burned cells −0.002 [−0.055, +0.051] (Section S2.1). A placebo</w:t>
       </w:r>
       <w:r>
         <w:t xml:space="preserve"> </w:t>
@@ -9369,7 +9369,7 @@
         <w:t xml:space="preserve"> </w:t>
       </w:r>
       <w:r>
-        <w:t xml:space="preserve">(Table S21). Across regions, the cost showed no relation to the share of distant cells in the study</w:t>
+        <w:t xml:space="preserve">(Table S1). Across regions, the cost showed no relation to the share of distant cells in the study</w:t>
       </w:r>
       <w:r>
         <w:t xml:space="preserve"> </w:t>
@@ -9463,7 +9463,7 @@
         <w:t xml:space="preserve"> </w:t>
       </w:r>
       <w:r>
-        <w:t xml:space="preserve">excluded, the data do not resolve this (Section S1.9.3).</w:t>
+        <w:t xml:space="preserve">excluded, the data do not resolve this (Section S2.1).</w:t>
       </w:r>
     </w:p>
     <w:bookmarkEnd w:id="59"/>
@@ -10139,7 +10139,7 @@
         <w:t xml:space="preserve"> </w:t>
       </w:r>
       <w:r>
-        <w:t xml:space="preserve">counts directions whose interval excludes 0.5, from a 10-cell (about 5 km) target-block bootstrap. Δ is the paired thermal-minus-baseline difference with a pair-cluster bootstrap interval, 1000 replicates (with 20000 replicates, as in Table S31, the collar interval is [−0.003, +0.051]). W − T is the within-region thermal gain minus the transfer gain, averaged by target region, with a Student</w:t>
+        <w:t xml:space="preserve">counts directions whose interval excludes 0.5, from a 10-cell (about 5 km) target-block bootstrap. Δ is the paired thermal-minus-baseline difference with a pair-cluster bootstrap interval, 1000 replicates (with 20000 replicates, as in Fig. S3, the collar interval is [−0.003, +0.051]). W − T is the within-region thermal gain minus the transfer gain, averaged by target region, with a Student</w:t>
       </w:r>
       <w:r>
         <w:t xml:space="preserve"> </w:t>
@@ -10175,7 +10175,7 @@
         <w:t xml:space="preserve"> </w:t>
       </w:r>
       <w:r>
-        <w:t xml:space="preserve">zero: clustering by target region and clustering by source region (Section S1.22). In an exploratory</w:t>
+        <w:t xml:space="preserve">zero: clustering by target region and clustering by source region (Fig. S3). In an exploratory</w:t>
       </w:r>
       <w:r>
         <w:t xml:space="preserve"> </w:t>
@@ -10187,7 +10187,7 @@
         <w:t xml:space="preserve"> </w:t>
       </w:r>
       <w:r>
-        <w:t xml:space="preserve">computed on the original areas and under four of six on the collar (Table S21). The margin was set</w:t>
+        <w:t xml:space="preserve">computed on the original areas and under four of six on the collar (Section S1.3). The margin was set</w:t>
       </w:r>
       <w:r>
         <w:t xml:space="preserve"> </w:t>
@@ -10248,7 +10248,7 @@
         <w:t xml:space="preserve"> </w:t>
       </w:r>
       <w:r>
-        <w:t xml:space="preserve">Montiferru in Table S14). Under the per-comparison criterion of</w:t>
+        <w:t xml:space="preserve">Montiferru in Table S4). Under the per-comparison criterion of</w:t>
       </w:r>
       <w:r>
         <w:t xml:space="preserve"> </w:t>
@@ -10314,7 +10314,7 @@
         <w:t xml:space="preserve"> </w:t>
       </w:r>
       <w:r>
-        <w:t xml:space="preserve">and 0.79; Section S1.19).</w:t>
+        <w:t xml:space="preserve">and 0.79; Section S3.2).</w:t>
       </w:r>
     </w:p>
     <w:p>
@@ -10374,7 +10374,7 @@
         <w:t xml:space="preserve"> </w:t>
       </w:r>
       <w:r>
-        <w:t xml:space="preserve">0.5 (Sections S1.11 and S1.23).</w:t>
+        <w:t xml:space="preserve">0.5 (Section S3.3).</w:t>
       </w:r>
     </w:p>
     <w:p>
@@ -10406,7 +10406,7 @@
         <w:t xml:space="preserve"> </w:t>
       </w:r>
       <w:r>
-        <w:t xml:space="preserve">do not use it (Section S1.19).</w:t>
+        <w:t xml:space="preserve">do not use it (Section S3.2).</w:t>
       </w:r>
     </w:p>
     <w:p>
@@ -10488,7 +10488,7 @@
         <w:t xml:space="preserve"> </w:t>
       </w:r>
       <w:r>
-        <w:t xml:space="preserve">each direction are given in Table S16.</w:t>
+        <w:t xml:space="preserve">each direction are given in Table S8.</w:t>
       </w:r>
     </w:p>
     <w:p>
@@ -10519,7 +10519,7 @@
         <w:t xml:space="preserve"> </w:t>
       </w:r>
       <w:r>
-        <w:t xml:space="preserve">six were below and five were uncertain; at 1 km blocking the intervals were narrower (Section S1.20).</w:t>
+        <w:t xml:space="preserve">six were below and five were uncertain; at 1 km blocking the intervals were narrower (Section S4.1).</w:t>
       </w:r>
       <w:r>
         <w:t xml:space="preserve"> </w:t>
@@ -10543,7 +10543,7 @@
         <w:t xml:space="preserve"> </w:t>
       </w:r>
       <w:r>
-        <w:t xml:space="preserve">far below within-region skill (Section S1.23).</w:t>
+        <w:t xml:space="preserve">far below within-region skill (Fig. S2).</w:t>
       </w:r>
     </w:p>
     <w:bookmarkStart w:id="65" w:name="fig_4"/>
@@ -10641,7 +10641,7 @@
         <w:t xml:space="preserve"> </w:t>
       </w:r>
       <w:r>
-        <w:t xml:space="preserve">(Table S32; the distance bins have no intervals).</w:t>
+        <w:t xml:space="preserve">(Fig. S5; the distance bins have no intervals).</w:t>
       </w:r>
     </w:p>
     <w:p>
@@ -10673,7 +10673,7 @@
         <w:t xml:space="preserve"> </w:t>
       </w:r>
       <w:r>
-        <w:t xml:space="preserve">Manavgat (Table S11). In map terms, the 10 % of target cells with the highest scores contained on</w:t>
+        <w:t xml:space="preserve">Manavgat (Table S10). In map terms, the 10 % of target cells with the highest scores contained on</w:t>
       </w:r>
       <w:r>
         <w:t xml:space="preserve"> </w:t>
@@ -10685,7 +10685,7 @@
         <w:t xml:space="preserve"> </w:t>
       </w:r>
       <w:r>
-        <w:t xml:space="preserve">directions did worse. Within regions, the same share was 35.5 % (Section S1.23).</w:t>
+        <w:t xml:space="preserve">directions did worse. Within regions, the same share was 35.5 % (Table S1).</w:t>
       </w:r>
     </w:p>
     <w:p>
@@ -10717,13 +10717,7 @@
         <w:t xml:space="preserve"> </w:t>
       </w:r>
       <w:r>
-        <w:t xml:space="preserve">transfer were −0.011, −0.019 and −0.021, all with pair-cluster intervals that include zero (Tables S25</w:t>
-      </w:r>
-      <w:r>
-        <w:t xml:space="preserve"> </w:t>
-      </w:r>
-      <w:r>
-        <w:t xml:space="preserve">and S35).</w:t>
+        <w:t xml:space="preserve">transfer were −0.011, −0.019 and −0.021, all with pair-cluster intervals that include zero (Fig. S2).</w:t>
       </w:r>
     </w:p>
     <w:p>
@@ -10749,7 +10743,7 @@
         <w:t xml:space="preserve"> </w:t>
       </w:r>
       <w:r>
-        <w:t xml:space="preserve">to +0.087 (Table S23). Within regions the two sets were almost equal (0.862 and 0.864).</w:t>
+        <w:t xml:space="preserve">to +0.087 (Section S1.2). Within regions the two sets were almost equal (0.862 and 0.864).</w:t>
       </w:r>
     </w:p>
     <w:p>
@@ -10781,7 +10775,7 @@
         <w:t xml:space="preserve"> </w:t>
       </w:r>
       <w:r>
-        <w:t xml:space="preserve">region) to [−0.028, +0.045] (pigeonhole bootstrap; Sections S1.15 and S1.23). A crossed</w:t>
+        <w:t xml:space="preserve">region) to [−0.028, +0.045] (pigeonhole bootstrap; Fig. S3). A crossed</w:t>
       </w:r>
       <w:r>
         <w:t xml:space="preserve"> </w:t>
@@ -10799,7 +10793,7 @@
         <w:t xml:space="preserve"> </w:t>
       </w:r>
       <w:r>
-        <w:t xml:space="preserve">independently (Table S35).</w:t>
+        <w:t xml:space="preserve">independently (Fig. S3).</w:t>
       </w:r>
     </w:p>
     <w:p>
@@ -10854,7 +10848,7 @@
         <w:t xml:space="preserve"> </w:t>
       </w:r>
       <w:r>
-        <w:t xml:space="preserve">seven directions showed negative recovery, five of them with intervals below zero (Section S1.10).</w:t>
+        <w:t xml:space="preserve">seven directions showed negative recovery, five of them with intervals below zero (Section S4.2).</w:t>
       </w:r>
       <w:r>
         <w:t xml:space="preserve"> </w:t>
@@ -10872,7 +10866,7 @@
         <w:t xml:space="preserve"> </w:t>
       </w:r>
       <w:r>
-        <w:t xml:space="preserve">(mean 0.507), and a stronger regularisation (λ = 1, mean 0.512) did not help (Section S1.23). These</w:t>
+        <w:t xml:space="preserve">(mean 0.507), and a stronger regularisation (λ = 1, mean 0.512) did not help (Section S1.2). These</w:t>
       </w:r>
       <w:r>
         <w:t xml:space="preserve"> </w:t>
@@ -11133,7 +11127,7 @@
         <w:t xml:space="preserve"> </w:t>
       </w:r>
       <w:r>
-        <w:t xml:space="preserve">is +0.014 [−0.028, +0.056] (Section S1.14).</w:t>
+        <w:t xml:space="preserve">is +0.014 [−0.028, +0.056] (Section S1.2).</w:t>
       </w:r>
     </w:p>
     <w:bookmarkStart w:id="78" w:name="fig_7"/>
@@ -11341,7 +11335,7 @@
         <w:t xml:space="preserve"> </w:t>
       </w:r>
       <w:r>
-        <w:t xml:space="preserve">On the original study areas, none predicted transfer with an interval that excludes zero (Table S17),</w:t>
+        <w:t xml:space="preserve">On the original study areas, none predicted transfer with an interval that excludes zero (Table S11),</w:t>
       </w:r>
       <w:r>
         <w:t xml:space="preserve"> </w:t>
@@ -11353,7 +11347,7 @@
         <w:t xml:space="preserve"> </w:t>
       </w:r>
       <w:r>
-        <w:t xml:space="preserve">(Section S1.23). Under the original Manavgat label, the two largest conditional measures, the</w:t>
+        <w:t xml:space="preserve">(Section S4.5). Under the original Manavgat label, the two largest conditional measures, the</w:t>
       </w:r>
       <w:r>
         <w:t xml:space="preserve"> </w:t>
@@ -11365,13 +11359,13 @@
         <w:t xml:space="preserve"> </w:t>
       </w:r>
       <w:r>
-        <w:t xml:space="preserve">label correction they did not, so this null result depends on the correction (Section S1.21). None</w:t>
-      </w:r>
-      <w:r>
-        <w:t xml:space="preserve"> </w:t>
-      </w:r>
-      <w:r>
-        <w:t xml:space="preserve">of the measures that can be computed before a fire predicted transfer (Section S1.21). The contrast pairs</w:t>
+        <w:t xml:space="preserve">label correction they did not, so this null result depends on the correction (Section S4.5). None</w:t>
+      </w:r>
+      <w:r>
+        <w:t xml:space="preserve"> </w:t>
+      </w:r>
+      <w:r>
+        <w:t xml:space="preserve">of the measures that can be computed before a fire predicted transfer (Section S4.5). The contrast pairs</w:t>
       </w:r>
       <w:r>
         <w:t xml:space="preserve"> </w:t>
@@ -11441,7 +11435,7 @@
         <w:t xml:space="preserve"> </w:t>
       </w:r>
       <w:r>
-        <w:t xml:space="preserve">only Muğla to Manavgat kept interval support (Section S1.16).</w:t>
+        <w:t xml:space="preserve">only Muğla to Manavgat kept interval support (Section S3.4).</w:t>
       </w:r>
     </w:p>
     <w:bookmarkStart w:id="82" w:name="fig_8"/>
@@ -11720,7 +11714,7 @@
         <w:t xml:space="preserve"> </w:t>
       </w:r>
       <w:r>
-        <w:t xml:space="preserve">coordinate-informed channels (Section S1.7), except terrain aspect in Montiferru (</w:t>
+        <w:t xml:space="preserve">coordinate-informed channels (Fig. S1), except terrain aspect in Montiferru (</w:t>
       </w:r>
       <w:hyperlink w:anchor="sec_3_2">
         <w:r>
@@ -11844,7 +11838,7 @@
         <w:t xml:space="preserve"> </w:t>
       </w:r>
       <w:r>
-        <w:t xml:space="preserve">populations and the study area and is reported only in Section S1.13.</w:t>
+        <w:t xml:space="preserve">populations and the study area and is reported only in Section S3.5.</w:t>
       </w:r>
     </w:p>
     <w:bookmarkEnd w:id="86"/>
@@ -11868,7 +11862,7 @@
         <w:t xml:space="preserve"> </w:t>
       </w:r>
       <w:r>
-        <w:t xml:space="preserve">within-region ceiling (Section S1.14). Removing the two reversing predictors cost 0.076 of</w:t>
+        <w:t xml:space="preserve">within-region ceiling (Section S4.4). Removing the two reversing predictors cost 0.076 of</w:t>
       </w:r>
       <w:r>
         <w:t xml:space="preserve"> </w:t>
@@ -11989,13 +11983,13 @@
         <w:t xml:space="preserve"> </w:t>
       </w:r>
       <w:r>
-        <w:t xml:space="preserve">air-temperature anomaly of the predictor window, but not its relative-humidity anomaly (Section</w:t>
-      </w:r>
-      <w:r>
-        <w:t xml:space="preserve"> </w:t>
-      </w:r>
-      <w:r>
-        <w:t xml:space="preserve">S1.23). The normalised channels did not transfer better than the absolute ones either (</w:t>
+        <w:t xml:space="preserve">air-temperature anomaly of the predictor window, but not its relative-humidity anomaly (Table</w:t>
+      </w:r>
+      <w:r>
+        <w:t xml:space="preserve"> </w:t>
+      </w:r>
+      <w:r>
+        <w:t xml:space="preserve">S1). The normalised channels did not transfer better than the absolute ones either (</w:t>
       </w:r>
       <w:hyperlink w:anchor="sec_3_5">
         <w:r>
@@ -12214,7 +12208,7 @@
         <w:t xml:space="preserve"> </w:t>
       </w:r>
       <w:r>
-        <w:t xml:space="preserve">(Table S35). Where a burned-area record of earlier fires exists for the target region, it can be used</w:t>
+        <w:t xml:space="preserve">(Table S1). Where a burned-area record of earlier fires exists for the target region, it can be used</w:t>
       </w:r>
       <w:r>
         <w:t xml:space="preserve"> </w:t>
@@ -12309,14 +12303,6 @@
     </w:p>
     <w:p>
       <w:pPr>
-        <w:pStyle w:val="FirstParagraph"/>
-      </w:pPr>
-      <w:r>
-        <w:t xml:space="preserve">Section S3.5 lists every limitation; these affect the conclusions.</w:t>
-      </w:r>
-    </w:p>
-    <w:p>
-      <w:pPr>
         <w:pStyle w:val="Compact"/>
         <w:numPr>
           <w:ilvl w:val="0"/>
@@ -12324,13 +12310,7 @@
         </w:numPr>
       </w:pPr>
       <w:r>
-        <w:t xml:space="preserve">Each region contributes one fire season, so region and event effects cannot be separated</w:t>
-      </w:r>
-      <w:r>
-        <w:t xml:space="preserve"> </w:t>
-      </w:r>
-      <w:r>
-        <w:t xml:space="preserve">(S3.5(v)).</w:t>
+        <w:t xml:space="preserve">Each region contributes one fire season, so region and event effects cannot be separated.</w:t>
       </w:r>
     </w:p>
     <w:p>
@@ -12359,7 +12339,7 @@
         </w:r>
       </w:hyperlink>
       <w:r>
-        <w:t xml:space="preserve">; S3.5(ix)).</w:t>
+        <w:t xml:space="preserve">).</w:t>
       </w:r>
     </w:p>
     <w:p>
@@ -12423,7 +12403,7 @@
         </w:r>
       </w:hyperlink>
       <w:r>
-        <w:t xml:space="preserve">; S1.23; S3.5(vi)).</w:t>
+        <w:t xml:space="preserve">; Table S1; Section S5.7).</w:t>
       </w:r>
     </w:p>
     <w:p>
@@ -12452,7 +12432,7 @@
         </w:r>
       </w:hyperlink>
       <w:r>
-        <w:t xml:space="preserve">; S1.23).</w:t>
+        <w:t xml:space="preserve">; Table S1).</w:t>
       </w:r>
     </w:p>
     <w:p>
@@ -12511,13 +12491,7 @@
         <w:t xml:space="preserve"> </w:t>
       </w:r>
       <w:r>
-        <w:t xml:space="preserve">bounds lie within 0.01 of 0.5, and one changed flag moved a correlation by about 0.2 (Section S1.20;</w:t>
-      </w:r>
-      <w:r>
-        <w:t xml:space="preserve"> </w:t>
-      </w:r>
-      <w:r>
-        <w:t xml:space="preserve">S3.5(viii), S3.5(xiii)).</w:t>
+        <w:t xml:space="preserve">bounds lie within 0.01 of 0.5, and one changed flag moved a correlation by about 0.2 (Section S4.5).</w:t>
       </w:r>
     </w:p>
     <w:p>
@@ -12576,7 +12550,7 @@
         <w:t xml:space="preserve"> </w:t>
       </w:r>
       <w:r>
-        <w:t xml:space="preserve">and in Manavgat burn timing and elevation are confounded (S3.5(vii), S3.5(xi)).</w:t>
+        <w:t xml:space="preserve">and in Manavgat burn timing and elevation are confounded (Sections S1.1 and S3.3).</w:t>
       </w:r>
     </w:p>
     <w:p>
@@ -12633,7 +12607,7 @@
         <w:t xml:space="preserve"> </w:t>
       </w:r>
       <w:r>
-        <w:t xml:space="preserve">fire perimeters were not used (S1.23; S3.5(iii)).</w:t>
+        <w:t xml:space="preserve">fire perimeters were not used (Figs. S1 and S2).</w:t>
       </w:r>
     </w:p>
     <w:p>
@@ -12668,7 +12642,7 @@
         </w:r>
       </w:hyperlink>
       <w:r>
-        <w:t xml:space="preserve">; S1.23).</w:t>
+        <w:t xml:space="preserve">; Figs. S1 and S2).</w:t>
       </w:r>
     </w:p>
     <w:p>
@@ -12680,7 +12654,7 @@
         </w:numPr>
       </w:pPr>
       <w:r>
-        <w:t xml:space="preserve">No weather predictors were used (S3.5(i)), and only four estimators were compared (S3.5(x)).</w:t>
+        <w:t xml:space="preserve">No weather predictors were used, and only four estimators were compared (Fig. S2).</w:t>
       </w:r>
     </w:p>
     <w:bookmarkEnd w:id="90"/>
@@ -12833,25 +12807,25 @@
         <w:pStyle w:val="FirstParagraph"/>
       </w:pPr>
       <w:r>
-        <w:t xml:space="preserve">Additional file 1 (Additional_file_1.pdf; PDF). Supplementary Material: sensitivity analyses and detail</w:t>
-      </w:r>
-      <w:r>
-        <w:t xml:space="preserve"> </w:t>
-      </w:r>
-      <w:r>
-        <w:t xml:space="preserve">(Sections S1.1 to S1.23), supporting tables (Section S2), protocol detail and the full list of limitations</w:t>
-      </w:r>
-      <w:r>
-        <w:t xml:space="preserve"> </w:t>
-      </w:r>
-      <w:r>
-        <w:t xml:space="preserve">(Section S3), the target-label recovery curve (Section S4) and Tables S1 to S36, each with</w:t>
-      </w:r>
-      <w:r>
-        <w:t xml:space="preserve"> </w:t>
-      </w:r>
-      <w:r>
-        <w:t xml:space="preserve">the source files of its values.</w:t>
+        <w:t xml:space="preserve">Additional file 1 (Additional_file_1.pdf; PDF). Supplementary Material: robustness checks (Section S1,</w:t>
+      </w:r>
+      <w:r>
+        <w:t xml:space="preserve"> </w:t>
+      </w:r>
+      <w:r>
+        <w:t xml:space="preserve">Figs. S1 to S3), the evaluation frame scar by scar and by distance (Section S2, Figs. S4 and S5), signed</w:t>
+      </w:r>
+      <w:r>
+        <w:t xml:space="preserve"> </w:t>
+      </w:r>
+      <w:r>
+        <w:t xml:space="preserve">associations and the frame test (Section S3), transfer, adaptation and similarity (Section S4), and data</w:t>
+      </w:r>
+      <w:r>
+        <w:t xml:space="preserve"> </w:t>
+      </w:r>
+      <w:r>
+        <w:t xml:space="preserve">and methods (Section S5), with Tables S1 to S15, each naming the source files of its values.</w:t>
       </w:r>
     </w:p>
     <w:bookmarkEnd w:id="94"/>
@@ -12869,7 +12843,7 @@
         <w:pStyle w:val="FirstParagraph"/>
       </w:pPr>
       <w:r>
-        <w:t xml:space="preserve">The authors thank the Department of Computer Engineering at Çukurova University for the laboratory environment in which this work was carried out. Claude (Anthropic; Opus-family models, July to October 2026) was used to write analysis and figure code, to check reported numbers, and to edit, restructure and shorten the text. The authors reviewed all of its output, made every scientific decision and take full responsibility for the content of the publication.</w:t>
+        <w:t xml:space="preserve">The authors thank the Department of Computer Engineering at Çukurova University for the laboratory environment in which this work was carried out. Claude (Anthropic; Opus-family models, July to October 2026) was used to write code, including the code that draws the figures, to check reported numbers, and to edit, restructure and shorten the text. The authors reviewed all of its output, made every scientific decision and take full responsibility for the content of the publication.</w:t>
       </w:r>
     </w:p>
     <w:bookmarkEnd w:id="95"/>
@@ -13154,7 +13128,7 @@
         <w:t xml:space="preserve"> </w:t>
       </w:r>
       <w:r>
-        <w:t xml:space="preserve">commit. The two small changes needed for this are given in Section S3.6.2. The pipeline’s own</w:t>
+        <w:t xml:space="preserve">commit. The two small changes needed for this are given in Section S5.7. The pipeline’s own</w:t>
       </w:r>
       <w:r>
         <w:t xml:space="preserve"> </w:t>
@@ -13278,7 +13252,7 @@
         <w:t xml:space="preserve"> </w:t>
       </w:r>
       <w:r>
-        <w:t xml:space="preserve">are drawn</w:t>
+        <w:t xml:space="preserve">and Figs. S1 to S5 are drawn</w:t>
       </w:r>
       <w:r>
         <w:t xml:space="preserve"> </w:t>
@@ -13319,7 +13293,7 @@
         <w:t xml:space="preserve"> </w:t>
       </w:r>
       <w:r>
-        <w:t xml:space="preserve">frozen outputs. The supplementary tables S2 to S7 and S9 to S18 are rebuilt row by row by</w:t>
+        <w:t xml:space="preserve">frozen outputs. Tables S2 to S4 and S7 to S11 are rebuilt row by row by</w:t>
       </w:r>
       <w:r>
         <w:t xml:space="preserve"> </w:t>

</xml_diff>